<commit_message>
fix: use calendar days in invoice acts
</commit_message>
<xml_diff>
--- a/supabase/functions/generate-document-pdf/template.docx
+++ b/supabase/functions/generate-document-pdf/template.docx
@@ -2958,16 +2958,16 @@
           <w:szCs w:val="20"/>
           <w:lang w:val="ru-RU"/>
         </w:rPr>
-        <w:t>рабочих</w:t>
-      </w:r>
-      <w:r>
-        <w:rPr>
-          <w:rFonts w:cs="Times New Roman"/>
-          <w:bCs/>
-          <w:sz w:val="20"/>
-          <w:szCs w:val="20"/>
-        </w:rPr>
-        <w:t xml:space="preserve"> </w:t>
+        <w:t/>
+      </w:r>
+      <w:r>
+        <w:rPr>
+          <w:rFonts w:cs="Times New Roman"/>
+          <w:bCs/>
+          <w:sz w:val="20"/>
+          <w:szCs w:val="20"/>
+        </w:rPr>
+        <w:t xml:space="preserve"/>
       </w:r>
       <w:r>
         <w:rPr>

</xml_diff>